<commit_message>
publish student projects (Fall 2026) 2026-09-22 21:03
</commit_message>
<xml_diff>
--- a/Games/subterranean-salvage.docx
+++ b/Games/subterranean-salvage.docx
@@ -2166,7 +2166,7 @@
         <w:t xml:space="preserve"> </w:t>
       </w:r>
       <w:r>
-        <w:t xml:space="preserve">6 CS + 1 Design + 2 Art (9) — a 2D pixel-art world (the Red Zone tileset, homes/ruins/chests, the drone, 3 enemy zombie types, ≥9 collectable items and the lighting/VFX) is a big art slot, so 2 artists; a solo designer owns the acoustic-stealth/extraction loop, the level and difficulty design and the item/point economy (rules: min 1 Design mandated, max 9 total, D+A ≤ 3; see</w:t>
+        <w:t xml:space="preserve">6 CS + 1 Design + 0 Art (7) — the solo designer owns the acoustic-stealth/extraction loop, the level and difficulty design and the item/point economy (rules: min 1 Design mandated, max 9 total, D+A ≤ 3; see</w:t>
       </w:r>
       <w:r>
         <w:t xml:space="preserve"> </w:t>
@@ -2178,7 +2178,52 @@
         <w:t xml:space="preserve">team-formation.pdf</w:t>
       </w:r>
       <w:r>
-        <w:t xml:space="preserve">). If level/content volume grows, trade the 2nd artist for a 2nd designer.</w:t>
+        <w:t xml:space="preserve">).</w:t>
+      </w:r>
+      <w:r>
+        <w:t xml:space="preserve"> </w:t>
+      </w:r>
+      <w:r>
+        <w:rPr>
+          <w:b/>
+        </w:rPr>
+        <w:t xml:space="preserve">Art-risk flag:</w:t>
+      </w:r>
+      <w:r>
+        <w:t xml:space="preserve"> </w:t>
+      </w:r>
+      <w:r>
+        <w:t xml:space="preserve">a 2D pixel-art world (the Red Zone tileset, homes/ruins/chests, the drone, 3 enemy zombie types, ≥9 collectable items and the lighting/VFX) is a real art surface, so</w:t>
+      </w:r>
+      <w:r>
+        <w:t xml:space="preserve"> </w:t>
+      </w:r>
+      <w:r>
+        <w:rPr>
+          <w:b/>
+        </w:rPr>
+        <w:t xml:space="preserve">0 artists is a serious risk</w:t>
+      </w:r>
+      <w:r>
+        <w:t xml:space="preserve"> </w:t>
+      </w:r>
+      <w:r>
+        <w:t xml:space="preserve">— the designer absorbs all art via the</w:t>
+      </w:r>
+      <w:r>
+        <w:t xml:space="preserve"> </w:t>
+      </w:r>
+      <w:r>
+        <w:rPr>
+          <w:b/>
+        </w:rPr>
+        <w:t xml:space="preserve">D11 conditional</w:t>
+      </w:r>
+      <w:r>
+        <w:t xml:space="preserve"> </w:t>
+      </w:r>
+      <w:r>
+        <w:t xml:space="preserve">(Art Proof of Concept M1 / Art Implementation Quality M2, the last Design goal each milestone), and art must be scoped hard (a single Red Zone tileset, a tight enemy/item set, placeholder-free but minimal) or the team should add an artist within D+A ≤ 3.</w:t>
       </w:r>
       <w:r>
         <w:t xml:space="preserve"> </w:t>
@@ -2267,6 +2312,18 @@
     <w:p>
       <w:pPr>
         <w:numPr>
+          <w:ilvl w:val="1"/>
+          <w:numId w:val="1018"/>
+        </w:numPr>
+        <w:pStyle w:val="Compact"/>
+      </w:pPr>
+      <w:r>
+        <w:t xml:space="preserve">M1D11 Art Proof of Concept (conditional — 0-artist team, Design-owned): the pixel visual direction — Red Zone tileset, homes/ruins/chests, the drone, the 3 zombie types, the collectable items, the cone-light/VFX; 2 mockup screens</w:t>
+      </w:r>
+    </w:p>
+    <w:p>
+      <w:pPr>
+        <w:numPr>
           <w:ilvl w:val="0"/>
           <w:numId w:val="1017"/>
         </w:numPr>
@@ -2300,7 +2357,7 @@
         <w:pStyle w:val="Compact"/>
       </w:pPr>
       <w:r>
-        <w:t xml:space="preserve">M2D3 Systems Balance &amp; Tuning — Data-Driven (enemy hearing, battery budget, loot value and difficulty placement via the team's JSON, no code changes)</w:t>
+        <w:t xml:space="preserve">M2D11 Art Implementation Quality (conditional — 0-artist team, Design-owned): all in-game art implemented in-engine, no placeholders — the Red Zone tileset, homes/ruins/chests, the drone, the 3 zombie types, the items and the lighting/VFX</w:t>
       </w:r>
     </w:p>
     <w:p>
@@ -2387,85 +2444,67 @@
         <w:rPr>
           <w:b/>
         </w:rPr>
-        <w:t xml:space="preserve">Art M1:</w:t>
-      </w:r>
-      <w:r>
-        <w:t xml:space="preserve"> </w:t>
-      </w:r>
-      <w:r>
-        <w:t xml:space="preserve">2 artists justified (pixel-art environment + enemies + items + lighting)</w:t>
-      </w:r>
-    </w:p>
-    <w:p>
-      <w:pPr>
-        <w:numPr>
-          <w:ilvl w:val="1"/>
-          <w:numId w:val="1022"/>
-        </w:numPr>
-        <w:pStyle w:val="Compact"/>
-      </w:pPr>
-      <w:r>
-        <w:t xml:space="preserve">M1A1 ⭐ (mockups: main menu + a Red Zone in play, lit by the cone light)</w:t>
-      </w:r>
-    </w:p>
-    <w:p>
-      <w:pPr>
-        <w:numPr>
-          <w:ilvl w:val="1"/>
-          <w:numId w:val="1022"/>
-        </w:numPr>
-        <w:pStyle w:val="Compact"/>
-      </w:pPr>
-      <w:r>
-        <w:t xml:space="preserve">M1A2 Characters (the drone + the 3 enemy zombie types — Normal, Avoidant, Aggressive, silhouette-first)</w:t>
-      </w:r>
-    </w:p>
-    <w:p>
-      <w:pPr>
-        <w:numPr>
-          <w:ilvl w:val="1"/>
-          <w:numId w:val="1022"/>
-        </w:numPr>
-        <w:pStyle w:val="Compact"/>
-      </w:pPr>
-      <w:r>
-        <w:t xml:space="preserve">M1A3 Environment (Red Zone tileset — homes, ruins, chests, safe/extraction zones)</w:t>
-      </w:r>
-    </w:p>
-    <w:p>
-      <w:pPr>
-        <w:numPr>
-          <w:ilvl w:val="1"/>
-          <w:numId w:val="1022"/>
-        </w:numPr>
-        <w:pStyle w:val="Compact"/>
-      </w:pPr>
-      <w:r>
-        <w:t xml:space="preserve">M1A4 UI Art Concepts &amp; Typography (battery/loot HUD, sound cue, extraction prompt)</w:t>
-      </w:r>
-    </w:p>
-    <w:p>
-      <w:pPr>
-        <w:numPr>
-          <w:ilvl w:val="1"/>
-          <w:numId w:val="1022"/>
-        </w:numPr>
-        <w:pStyle w:val="Compact"/>
-      </w:pPr>
-      <w:r>
-        <w:t xml:space="preserve">M1A5 Animation Foundations (drone move/propulsion, enemy idle/alert/chase, chest-open)</w:t>
-      </w:r>
-    </w:p>
-    <w:p>
-      <w:pPr>
-        <w:numPr>
-          <w:ilvl w:val="1"/>
-          <w:numId w:val="1022"/>
-        </w:numPr>
-        <w:pStyle w:val="Compact"/>
-      </w:pPr>
-      <w:r>
-        <w:t xml:space="preserve">M1A6 Early Asset Production (incl. the first item sets)</w:t>
+        <w:t xml:space="preserve">Art:</w:t>
+      </w:r>
+      <w:r>
+        <w:t xml:space="preserve"> </w:t>
+      </w:r>
+      <w:r>
+        <w:rPr>
+          <w:i/>
+        </w:rPr>
+        <w:t xml:space="preserve">no artist on this team (0 Art).</w:t>
+      </w:r>
+      <w:r>
+        <w:t xml:space="preserve"> </w:t>
+      </w:r>
+      <w:r>
+        <w:t xml:space="preserve">The pixel-art surface (Red Zone tileset, homes/ruins/chests, the drone, the 3 zombie types, the ≥9 items, cone-light/VFX) is owned by the designer through the</w:t>
+      </w:r>
+      <w:r>
+        <w:t xml:space="preserve"> </w:t>
+      </w:r>
+      <w:r>
+        <w:rPr>
+          <w:b/>
+        </w:rPr>
+        <w:t xml:space="preserve">D11 conditional</w:t>
+      </w:r>
+      <w:r>
+        <w:t xml:space="preserve"> </w:t>
+      </w:r>
+      <w:r>
+        <w:t xml:space="preserve">—</w:t>
+      </w:r>
+      <w:r>
+        <w:t xml:space="preserve"> </w:t>
+      </w:r>
+      <w:r>
+        <w:rPr>
+          <w:b/>
+        </w:rPr>
+        <w:t xml:space="preserve">M1D11 Art Proof of Concept</w:t>
+      </w:r>
+      <w:r>
+        <w:t xml:space="preserve"> </w:t>
+      </w:r>
+      <w:r>
+        <w:t xml:space="preserve">(visual direction + 2 mockups) and</w:t>
+      </w:r>
+      <w:r>
+        <w:t xml:space="preserve"> </w:t>
+      </w:r>
+      <w:r>
+        <w:rPr>
+          <w:b/>
+        </w:rPr>
+        <w:t xml:space="preserve">M2D11 Art Implementation Quality</w:t>
+      </w:r>
+      <w:r>
+        <w:t xml:space="preserve"> </w:t>
+      </w:r>
+      <w:r>
+        <w:t xml:space="preserve">(all art in-engine, no placeholders), shown above as the last Design goal each milestone. Scope art hard, or add an artist within D+A ≤ 3.</w:t>
       </w:r>
     </w:p>
     <w:p>
@@ -2480,79 +2519,61 @@
         <w:rPr>
           <w:b/>
         </w:rPr>
-        <w:t xml:space="preserve">Art M2:</w:t>
-      </w:r>
-    </w:p>
-    <w:p>
-      <w:pPr>
-        <w:numPr>
-          <w:ilvl w:val="1"/>
-          <w:numId w:val="1023"/>
-        </w:numPr>
-        <w:pStyle w:val="Compact"/>
-      </w:pPr>
-      <w:r>
-        <w:t xml:space="preserve">M2A1 ⭐</w:t>
-      </w:r>
-    </w:p>
-    <w:p>
-      <w:pPr>
-        <w:numPr>
-          <w:ilvl w:val="1"/>
-          <w:numId w:val="1023"/>
-        </w:numPr>
-        <w:pStyle w:val="Compact"/>
-      </w:pPr>
-      <w:r>
-        <w:t xml:space="preserve">M2A2 Extensive Animation (enemy behaviours per type, drone states, loot interactions)</w:t>
-      </w:r>
-    </w:p>
-    <w:p>
-      <w:pPr>
-        <w:numPr>
-          <w:ilvl w:val="1"/>
-          <w:numId w:val="1023"/>
-        </w:numPr>
-        <w:pStyle w:val="Compact"/>
-      </w:pPr>
-      <w:r>
-        <w:t xml:space="preserve">M2A3 Environment Alive (ambient motion, the ≥9 collectable-item art depicting the past)</w:t>
-      </w:r>
-    </w:p>
-    <w:p>
-      <w:pPr>
-        <w:numPr>
-          <w:ilvl w:val="1"/>
-          <w:numId w:val="1023"/>
-        </w:numPr>
-        <w:pStyle w:val="Compact"/>
-      </w:pPr>
-      <w:r>
-        <w:t xml:space="preserve">M2A4 UI Art — States &amp; Feedback (heard/alerted, low battery, item rarity, extraction success)</w:t>
-      </w:r>
-    </w:p>
-    <w:p>
-      <w:pPr>
-        <w:numPr>
-          <w:ilvl w:val="1"/>
-          <w:numId w:val="1023"/>
-        </w:numPr>
-        <w:pStyle w:val="Compact"/>
-      </w:pPr>
-      <w:r>
-        <w:t xml:space="preserve">M2A5 VFX — Effects &amp; Transitions (sound-wave visuals, cone-light glow, extraction)</w:t>
-      </w:r>
-    </w:p>
-    <w:p>
-      <w:pPr>
-        <w:numPr>
-          <w:ilvl w:val="1"/>
-          <w:numId w:val="1023"/>
-        </w:numPr>
-        <w:pStyle w:val="Compact"/>
-      </w:pPr>
-      <w:r>
-        <w:t xml:space="preserve">M2A6 Cutscenes &amp; Storyboards (intro to the Red Zone premise)</w:t>
+        <w:t xml:space="preserve">TEAM M1:</w:t>
+      </w:r>
+    </w:p>
+    <w:p>
+      <w:pPr>
+        <w:numPr>
+          <w:ilvl w:val="1"/>
+          <w:numId w:val="1022"/>
+        </w:numPr>
+        <w:pStyle w:val="Compact"/>
+      </w:pPr>
+      <w:r>
+        <w:t xml:space="preserve">M1TA1 ⭐ Overall Audio Experience —</w:t>
+      </w:r>
+      <w:r>
+        <w:t xml:space="preserve"> </w:t>
+      </w:r>
+      <w:r>
+        <w:rPr>
+          <w:b/>
+        </w:rPr>
+        <w:t xml:space="preserve">audio is load-bearing here</w:t>
+      </w:r>
+      <w:r>
+        <w:t xml:space="preserve"> </w:t>
+      </w:r>
+      <w:r>
+        <w:t xml:space="preserve">(sound IS the mechanic): the SFX the acoustic system emits (propulsion, chest-crack, footstep, enemy alert) must be present, suitable, and</w:t>
+      </w:r>
+      <w:r>
+        <w:t xml:space="preserve"> </w:t>
+      </w:r>
+      <w:r>
+        <w:rPr>
+          <w:b/>
+        </w:rPr>
+        <w:t xml:space="preserve">correctly synced</w:t>
+      </w:r>
+      <w:r>
+        <w:t xml:space="preserve"> </w:t>
+      </w:r>
+      <w:r>
+        <w:t xml:space="preserve">to the sound-raycasting events in the prototype, plus atmospheric BGM.</w:t>
+      </w:r>
+    </w:p>
+    <w:p>
+      <w:pPr>
+        <w:numPr>
+          <w:ilvl w:val="1"/>
+          <w:numId w:val="1022"/>
+        </w:numPr>
+        <w:pStyle w:val="Compact"/>
+      </w:pPr>
+      <w:r>
+        <w:t xml:space="preserve">M1TA2 ⭐ Audio Engine Functionality — data-driven audio pipeline (add/replace files without recompiling) + reliable multi-channel playback (many overlapping sound sources) tied to the acoustic model.</w:t>
       </w:r>
     </w:p>
     <w:p>
@@ -2567,75 +2588,6 @@
         <w:rPr>
           <w:b/>
         </w:rPr>
-        <w:t xml:space="preserve">TEAM M1:</w:t>
-      </w:r>
-    </w:p>
-    <w:p>
-      <w:pPr>
-        <w:numPr>
-          <w:ilvl w:val="1"/>
-          <w:numId w:val="1024"/>
-        </w:numPr>
-        <w:pStyle w:val="Compact"/>
-      </w:pPr>
-      <w:r>
-        <w:t xml:space="preserve">M1TA1 ⭐ Overall Audio Experience —</w:t>
-      </w:r>
-      <w:r>
-        <w:t xml:space="preserve"> </w:t>
-      </w:r>
-      <w:r>
-        <w:rPr>
-          <w:b/>
-        </w:rPr>
-        <w:t xml:space="preserve">audio is load-bearing here</w:t>
-      </w:r>
-      <w:r>
-        <w:t xml:space="preserve"> </w:t>
-      </w:r>
-      <w:r>
-        <w:t xml:space="preserve">(sound IS the mechanic): the SFX the acoustic system emits (propulsion, chest-crack, footstep, enemy alert) must be present, suitable, and</w:t>
-      </w:r>
-      <w:r>
-        <w:t xml:space="preserve"> </w:t>
-      </w:r>
-      <w:r>
-        <w:rPr>
-          <w:b/>
-        </w:rPr>
-        <w:t xml:space="preserve">correctly synced</w:t>
-      </w:r>
-      <w:r>
-        <w:t xml:space="preserve"> </w:t>
-      </w:r>
-      <w:r>
-        <w:t xml:space="preserve">to the sound-raycasting events in the prototype, plus atmospheric BGM.</w:t>
-      </w:r>
-    </w:p>
-    <w:p>
-      <w:pPr>
-        <w:numPr>
-          <w:ilvl w:val="1"/>
-          <w:numId w:val="1024"/>
-        </w:numPr>
-        <w:pStyle w:val="Compact"/>
-      </w:pPr>
-      <w:r>
-        <w:t xml:space="preserve">M1TA2 ⭐ Audio Engine Functionality — data-driven audio pipeline (add/replace files without recompiling) + reliable multi-channel playback (many overlapping sound sources) tied to the acoustic model.</w:t>
-      </w:r>
-    </w:p>
-    <w:p>
-      <w:pPr>
-        <w:numPr>
-          <w:ilvl w:val="0"/>
-          <w:numId w:val="1017"/>
-        </w:numPr>
-        <w:pStyle w:val="Compact"/>
-      </w:pPr>
-      <w:r>
-        <w:rPr>
-          <w:b/>
-        </w:rPr>
         <w:t xml:space="preserve">TEAM M2:</w:t>
       </w:r>
     </w:p>
@@ -2643,7 +2595,7 @@
       <w:pPr>
         <w:numPr>
           <w:ilvl w:val="1"/>
-          <w:numId w:val="1025"/>
+          <w:numId w:val="1023"/>
         </w:numPr>
         <w:pStyle w:val="Compact"/>
       </w:pPr>
@@ -2667,7 +2619,7 @@
       <w:pPr>
         <w:numPr>
           <w:ilvl w:val="1"/>
-          <w:numId w:val="1025"/>
+          <w:numId w:val="1023"/>
         </w:numPr>
         <w:pStyle w:val="Compact"/>
       </w:pPr>
@@ -2679,7 +2631,7 @@
       <w:pPr>
         <w:numPr>
           <w:ilvl w:val="1"/>
-          <w:numId w:val="1025"/>
+          <w:numId w:val="1023"/>
         </w:numPr>
         <w:pStyle w:val="Compact"/>
       </w:pPr>
@@ -3024,12 +2976,6 @@
     <w:abstractNumId w:val="991"/>
   </w:num>
   <w:num w:numId="1023">
-    <w:abstractNumId w:val="991"/>
-  </w:num>
-  <w:num w:numId="1024">
-    <w:abstractNumId w:val="991"/>
-  </w:num>
-  <w:num w:numId="1025">
     <w:abstractNumId w:val="991"/>
   </w:num>
 </w:numbering>

</xml_diff>